<commit_message>
feat: update Lab 02 documentation to include Network Monitor and experiment recording procedures
</commit_message>
<xml_diff>
--- a/education/evidencias_abet/INSTRUMENTO_ABET_LAB_02_PRUEBAS_CAMARA_KINOVA_VISION.docx
+++ b/education/evidencias_abet/INSTRUMENTO_ABET_LAB_02_PRUEBAS_CAMARA_KINOVA_VISION.docx
@@ -15,7 +15,7 @@
         </w:rPr>
         <w:t>INSTRUMENTO DE EVIDENCIA Y CALIFICACIÓN ACADÉMICA</w:t>
         <w:br/>
-        <w:t>LABORATORIO 02 — PRUEBAS DE CÁMARA, COMPRESIÓN Y CYCLONEDDS</w:t>
+        <w:t>LABORATORIO 02 — PRUEBAS DE CÁMARA, COMPRESIÓN, CYCLONEDDS Y MONITOR DE RED</w:t>
       </w:r>
     </w:p>
     <w:tbl>
@@ -44,7 +44,7 @@
                 <w:b w:val="0"/>
                 <w:sz w:val="16"/>
               </w:rPr>
-              <w:t>Versión 1.1 — Instrumento de captura y entrega consolidada asociado a la Guía de Laboratorio 02. El informe común reúne las evidencias técnicas del equipo (Dispositivo A: Gateway y Dispositivo B: Wi-Fi); el Anexo A verifica la autoría, comprensión y contribución técnica individual de cada estudiante para sustentar el logro individual ABET. La nota académica no se interpreta como un nivel ABET global.</w:t>
+              <w:t>Versión 1.2 — Instrumento de captura y entrega consolidada asociado a la Guía de Laboratorio 02. El informe común reúne las evidencias técnicas del equipo, telemetría CSV del Monitor de Red y enlace al video del experimento; el Anexo A verifica la autoría, comprensión y contribución técnica individual de cada estudiante para sustentar el logro individual ABET. La nota académica no se interpreta como un nivel ABET global.</w:t>
             </w:r>
           </w:p>
         </w:tc>
@@ -316,7 +316,7 @@
                 <w:b w:val="0"/>
                 <w:sz w:val="15"/>
               </w:rPr>
-              <w:t>Laboratorio 02 — Pruebas de cámara, compresión de video y CycloneDDS en Wi-Fi</w:t>
+              <w:t>Laboratorio 02 — Pruebas de cámara, compresión de video, CycloneDDS y Monitor de Red</w:t>
             </w:r>
           </w:p>
         </w:tc>
@@ -558,7 +558,7 @@
                 <w:b w:val="0"/>
                 <w:sz w:val="15"/>
               </w:rPr>
-              <w:t>Versión 1.1</w:t>
+              <w:t>Versión 1.2</w:t>
             </w:r>
           </w:p>
         </w:tc>
@@ -1598,7 +1598,7 @@
                 <w:b w:val="0"/>
                 <w:sz w:val="15"/>
               </w:rPr>
-              <w:t>C3. Arquitectura distribuida con CycloneDDS y QoS</w:t>
+              <w:t>C3. Arquitectura distribuida con CycloneDDS y Monitor de Red</w:t>
             </w:r>
           </w:p>
         </w:tc>
@@ -1677,7 +1677,7 @@
                 <w:b w:val="0"/>
                 <w:sz w:val="15"/>
               </w:rPr>
-              <w:t>C4. Documentación técnica, reproducibilidad y capturas</w:t>
+              <w:t>C4. Documentación técnica, telemetría y grabación de video</w:t>
             </w:r>
           </w:p>
         </w:tc>
@@ -2243,7 +2243,7 @@
                 <w:b w:val="0"/>
                 <w:sz w:val="15"/>
               </w:rPr>
-              <w:t>Archivo cyclonedds.xml y captura de verificación de recepción remota en Dispositivo B sobre Wi-Fi.</w:t>
+              <w:t>Captura del Dashboard del Monitor de Red (:8080) y archivo de telemetría exportado (telemetria_red_lab02.csv).</w:t>
             </w:r>
           </w:p>
         </w:tc>
@@ -2302,7 +2302,7 @@
                 <w:b w:val="0"/>
                 <w:sz w:val="15"/>
               </w:rPr>
-              <w:t>Matriz diligenciada del diagnóstico por capas ante las 5 fallas inducidas y su recuperación.</w:t>
+              <w:t>Archivo cyclonedds.xml y captura de verificación de recepción remota en Dispositivo B sobre Wi-Fi.</w:t>
             </w:r>
           </w:p>
         </w:tc>
@@ -2343,6 +2343,125 @@
                 <w:sz w:val="15"/>
               </w:rPr>
               <w:t>E8</w:t>
+            </w:r>
+          </w:p>
+        </w:tc>
+        <w:tc>
+          <w:tcPr>
+            <w:tcW w:type="dxa" w:w="5669"/>
+            <w:shd w:fill="F2F2F2"/>
+            <w:vAlign w:val="center"/>
+          </w:tcPr>
+          <w:p>
+            <w:pPr>
+              <w:spacing w:after="0" w:before="0"/>
+            </w:pPr>
+            <w:r>
+              <w:rPr>
+                <w:rFonts w:ascii="Arial" w:hAnsi="Arial"/>
+                <w:b w:val="0"/>
+                <w:sz w:val="15"/>
+              </w:rPr>
+              <w:t>Matriz diligenciada del diagnóstico por capas ante las 5 fallas inducidas y su recuperación.</w:t>
+            </w:r>
+          </w:p>
+        </w:tc>
+        <w:tc>
+          <w:tcPr>
+            <w:tcW w:type="dxa" w:w="2835"/>
+            <w:shd w:fill="F2F2F2"/>
+            <w:vAlign w:val="center"/>
+          </w:tcPr>
+          <w:p>
+            <w:pPr>
+              <w:spacing w:after="0" w:before="0"/>
+            </w:pPr>
+            <w:r>
+              <w:rPr>
+                <w:rFonts w:ascii="Arial" w:hAnsi="Arial"/>
+                <w:b w:val="0"/>
+                <w:sz w:val="15"/>
+              </w:rPr>
+            </w:r>
+          </w:p>
+        </w:tc>
+      </w:tr>
+      <w:tr>
+        <w:tc>
+          <w:tcPr>
+            <w:tcW w:type="dxa" w:w="1134"/>
+            <w:vAlign w:val="center"/>
+          </w:tcPr>
+          <w:p>
+            <w:pPr>
+              <w:spacing w:after="0" w:before="0"/>
+            </w:pPr>
+            <w:r>
+              <w:rPr>
+                <w:rFonts w:ascii="Arial" w:hAnsi="Arial"/>
+                <w:b w:val="0"/>
+                <w:sz w:val="15"/>
+              </w:rPr>
+              <w:t>E9</w:t>
+            </w:r>
+          </w:p>
+        </w:tc>
+        <w:tc>
+          <w:tcPr>
+            <w:tcW w:type="dxa" w:w="5669"/>
+            <w:vAlign w:val="center"/>
+          </w:tcPr>
+          <w:p>
+            <w:pPr>
+              <w:spacing w:after="0" w:before="0"/>
+            </w:pPr>
+            <w:r>
+              <w:rPr>
+                <w:rFonts w:ascii="Arial" w:hAnsi="Arial"/>
+                <w:b w:val="0"/>
+                <w:sz w:val="15"/>
+              </w:rPr>
+              <w:t>Video continuo del experimento (2–4 min) que muestra terminales en PC A, visor en PC B, monitor y sustentación.</w:t>
+            </w:r>
+          </w:p>
+        </w:tc>
+        <w:tc>
+          <w:tcPr>
+            <w:tcW w:type="dxa" w:w="2835"/>
+            <w:vAlign w:val="center"/>
+          </w:tcPr>
+          <w:p>
+            <w:pPr>
+              <w:spacing w:after="0" w:before="0"/>
+            </w:pPr>
+            <w:r>
+              <w:rPr>
+                <w:rFonts w:ascii="Arial" w:hAnsi="Arial"/>
+                <w:b w:val="0"/>
+                <w:sz w:val="15"/>
+              </w:rPr>
+            </w:r>
+          </w:p>
+        </w:tc>
+      </w:tr>
+      <w:tr>
+        <w:tc>
+          <w:tcPr>
+            <w:tcW w:type="dxa" w:w="1134"/>
+            <w:shd w:fill="F2F2F2"/>
+            <w:vAlign w:val="center"/>
+          </w:tcPr>
+          <w:p>
+            <w:pPr>
+              <w:spacing w:after="0" w:before="0"/>
+            </w:pPr>
+            <w:r>
+              <w:rPr>
+                <w:rFonts w:ascii="Arial" w:hAnsi="Arial"/>
+                <w:b w:val="0"/>
+                <w:sz w:val="15"/>
+              </w:rPr>
+              <w:t>E10</w:t>
             </w:r>
           </w:p>
         </w:tc>
@@ -2470,7 +2589,7 @@
                 <w:b w:val="0"/>
                 <w:sz w:val="15"/>
               </w:rPr>
-              <w:t>1. Rol desempeñado y tareas técnicas concretas realizadas (Gateway en PC A vs Procesamiento en PC B).</w:t>
+              <w:t>1. Rol desempeñado y tareas técnicas concretas realizadas (Gateway en PC A vs Procesamiento en PC B vs Monitor de Red).</w:t>
             </w:r>
           </w:p>
         </w:tc>
@@ -2550,7 +2669,7 @@
                 <w:b w:val="0"/>
                 <w:sz w:val="15"/>
               </w:rPr>
-              <w:t>3. Explicación de la configuración de rmw_cyclonedds_cpp y NetworkInterfaceAddress en cyclonedds.xml.</w:t>
+              <w:t>3. Explicación de la configuración de CycloneDDS y métricas de telemetría observadas en el Monitor de Red.</w:t>
             </w:r>
           </w:p>
         </w:tc>
@@ -2630,7 +2749,7 @@
                 <w:b w:val="0"/>
                 <w:sz w:val="15"/>
               </w:rPr>
-              <w:t>5. Identificación de los comandos, tablas, capturas o secciones del informe de su autoría directa.</w:t>
+              <w:t>5. Identificación de los comandos, tablas, capturas, log CSV o secciones del video de su autoría y sustentación directa.</w:t>
             </w:r>
           </w:p>
         </w:tc>
@@ -3213,7 +3332,7 @@
                 <w:b w:val="0"/>
                 <w:sz w:val="15"/>
               </w:rPr>
-              <w:t>Además de N4, cuantifica y compara el impacto de cada falla inducida sobre la tasa de cuadros y el jitter, relaciona síntomas con logs detallados de DDS y FFMPEG, y formula un árbol de decisión para diagnóstico rápido transferible a producción.</w:t>
+              <w:t>Además de N4, cuantifica y compara el impacto de cada falla inducida sobre la tasa de cuadros y el jitter, relaciona síntomas con logs detallados del Monitor de Red y FFMPEG, y formula un árbol de decisión para diagnóstico rápido transferible a producción.</w:t>
             </w:r>
           </w:p>
         </w:tc>
@@ -3475,7 +3594,7 @@
           <w:rFonts w:ascii="Arial" w:hAnsi="Arial"/>
           <w:color w:val="1F4E79"/>
         </w:rPr>
-        <w:t>C3. Arquitectura distribuida con CycloneDDS y QoS — 20% — Student Outcome SO2</w:t>
+        <w:t>C3. Arquitectura distribuida con CycloneDDS y Monitor de Red — 20% — Student Outcome SO2</w:t>
       </w:r>
     </w:p>
     <w:tbl>
@@ -3609,7 +3728,7 @@
                 <w:b w:val="0"/>
                 <w:sz w:val="15"/>
               </w:rPr>
-              <w:t>Además de N4, analiza la estructura de paquetes RTPS en Wi-Fi, optimiza parámetros avanzados en cyclonedds.xml (MaxMessageSize, fragmentación UDP) y justifica las políticas QoS SensorData frente a escenarios de alta interferencia inalámbrica.</w:t>
+              <w:t>Además de N4, analiza la estructura de paquetes RTPS en Wi-Fi, optimiza parámetros avanzados en cyclonedds.xml (MaxMessageSize, fragmentación UDP), exporta telemetría CSV completa desde el Monitor de Red y justifica las políticas QoS SensorData.</w:t>
             </w:r>
           </w:p>
         </w:tc>
@@ -3671,7 +3790,7 @@
                 <w:b w:val="0"/>
                 <w:sz w:val="15"/>
               </w:rPr>
-              <w:t>Configura rmw_cyclonedds_cpp en ambos equipos, define cyclonedds.xml con interfaz wlan0, y verifica recepción remota fluida (&gt;= 20 Hz) en Dispositivo B sin pérdida de paquetes.</w:t>
+              <w:t>Configura rmw_cyclonedds_cpp en ambos equipos, define cyclonedds.xml con interfaz wlan0, lanza el Monitor de Red (:8080) y verifica recepción remota fluida (&gt;= 20 Hz) en Dispositivo B.</w:t>
             </w:r>
           </w:p>
         </w:tc>
@@ -3730,7 +3849,7 @@
                 <w:b w:val="0"/>
                 <w:sz w:val="15"/>
               </w:rPr>
-              <w:t>Establece comunicación distribuida con CycloneDDS en el mismo ROS_DOMAIN_ID y recibe el tópico de video comprimido en el Dispositivo B.</w:t>
+              <w:t>Establece comunicación distribuida con CycloneDDS en el mismo ROS_DOMAIN_ID, lanza el monitor de red y recibe el tópico de video comprimido en el Dispositivo B.</w:t>
             </w:r>
           </w:p>
         </w:tc>
@@ -3792,7 +3911,7 @@
                 <w:b w:val="0"/>
                 <w:sz w:val="15"/>
               </w:rPr>
-              <w:t>La comunicación distribuida es intermitente debido a conflictos de RMW o falta de configuración de interfaz en cyclonedds.xml.</w:t>
+              <w:t>La comunicación distribuida es intermitente debido a conflictos de RMW o no se registran métricas del monitor de red.</w:t>
             </w:r>
           </w:p>
         </w:tc>
@@ -3851,7 +3970,7 @@
                 <w:b w:val="0"/>
                 <w:sz w:val="15"/>
               </w:rPr>
-              <w:t>No logra comunicación distribuida entre Dispositivo A y B o carece de evidencia sobre el middleware.</w:t>
+              <w:t>No logra comunicación distribuida entre Dispositivo A y B o carece de evidencia sobre el middleware y telemetría.</w:t>
             </w:r>
           </w:p>
         </w:tc>
@@ -3871,7 +3990,7 @@
           <w:rFonts w:ascii="Arial" w:hAnsi="Arial"/>
           <w:color w:val="1F4E79"/>
         </w:rPr>
-        <w:t>C4. Documentación técnica, reproducibilidad y capturas — 15% — Student Outcome SO3</w:t>
+        <w:t>C4. Documentación técnica, telemetría y grabación de video — 15% — Student Outcome SO3</w:t>
       </w:r>
     </w:p>
     <w:tbl>
@@ -4005,7 +4124,7 @@
                 <w:b w:val="0"/>
                 <w:sz w:val="15"/>
               </w:rPr>
-              <w:t>Además de N4, el informe incluye diagramas de arquitectura distribuida multi-PC impecables, tablas completas de caracterización, capturas PNG de dataset etiquetadas y un README que permite reproducir todo el laboratorio de forma autónoma.</w:t>
+              <w:t>Además de N4, el informe incluye diagramas de arquitectura impecables, telemetría CSV estructurada con análisis estadístico de jitter/latencia, y un video continuo de demostración (2–4 min) con excelente edición y sustentación técnica fluida de ambos estudiantes.</w:t>
             </w:r>
           </w:p>
         </w:tc>
@@ -4067,7 +4186,7 @@
                 <w:b w:val="0"/>
                 <w:sz w:val="15"/>
               </w:rPr>
-              <w:t>Informe técnico ordenado y trazable con comandos reproducibles, tablas diligenciadas, capturas de video/profundidad y análisis técnico coherente.</w:t>
+              <w:t>Informe técnico ordenado y trazable con comandos reproducibles, tablas diligenciadas, capturas PNG, log CSV del monitor de red y video continuo demostrando la operación distribuida y recuperación ante fallas.</w:t>
             </w:r>
           </w:p>
         </w:tc>
@@ -4126,7 +4245,7 @@
                 <w:b w:val="0"/>
                 <w:sz w:val="15"/>
               </w:rPr>
-              <w:t>Entrega el informe con los comandos esenciales, tablas de datos diligenciadas, capturas fotográficas y conclusiones básicas.</w:t>
+              <w:t>Entrega el informe con comandos esenciales, tablas de datos diligenciadas, capturas fotográficas, log CSV y enlace al video del experimento.</w:t>
             </w:r>
           </w:p>
         </w:tc>
@@ -4188,7 +4307,7 @@
                 <w:b w:val="0"/>
                 <w:sz w:val="15"/>
               </w:rPr>
-              <w:t>Documento incompleto con capturas aisladas, tablas vacías o explicaciones vagas sin trazabilidad a comandos reales.</w:t>
+              <w:t>Documento incompleto sin telemetría CSV o video inaccesible/incompleto sin demostración de la operación distribuida.</w:t>
             </w:r>
           </w:p>
         </w:tc>
@@ -4247,7 +4366,7 @@
                 <w:b w:val="0"/>
                 <w:sz w:val="15"/>
               </w:rPr>
-              <w:t>Informe fragmentario, no atribuible o sin evidencia funcional verificable.</w:t>
+              <w:t>Informe fragmentario, sin video del experimento o sin evidencia funcional verificable.</w:t>
             </w:r>
           </w:p>
         </w:tc>
@@ -4401,7 +4520,7 @@
                 <w:b w:val="0"/>
                 <w:sz w:val="15"/>
               </w:rPr>
-              <w:t>Además de N4, propone protocolos de seguridad física y ciberseguridad para cámaras en celdas industriales (VLANs, gestión de credenciales) y el Anexo A demuestra una coordinación y dominio técnico individual sobresaliente entre Gateway y estación remota.</w:t>
+              <w:t>Además de N4, propone protocolos de seguridad física y ciberseguridad para cámaras en celdas industriales (VLANs, gestión de credenciales) y el Anexo A junto con el video demuestran una coordinación y dominio técnico individual sobresaliente entre Gateway y estación remota.</w:t>
             </w:r>
           </w:p>
         </w:tc>
@@ -4996,7 +5115,7 @@
                 <w:b w:val="0"/>
                 <w:sz w:val="15"/>
               </w:rPr>
-              <w:t>C3. Arquitectura distribuida con CycloneDDS y QoS</w:t>
+              <w:t>C3. Arquitectura distribuida con CycloneDDS y Monitor de Red</w:t>
             </w:r>
           </w:p>
         </w:tc>
@@ -5091,7 +5210,7 @@
                 <w:b w:val="0"/>
                 <w:sz w:val="15"/>
               </w:rPr>
-              <w:t>C4. Documentación técnica, reproducibilidad y capturas</w:t>
+              <w:t>C4. Documentación técnica, telemetría y grabación de video</w:t>
             </w:r>
           </w:p>
         </w:tc>
@@ -5801,7 +5920,7 @@
                 <w:b w:val="0"/>
                 <w:sz w:val="15"/>
               </w:rPr>
-              <w:t>SO2 / Indicador 2.1 (CycloneDDS y QoS)</w:t>
+              <w:t>SO2 / Indicador 2.1 (CycloneDDS y Telemetría QoS)</w:t>
             </w:r>
           </w:p>
         </w:tc>
@@ -5914,7 +6033,7 @@
                 <w:b w:val="0"/>
                 <w:sz w:val="15"/>
               </w:rPr>
-              <w:t>SO3 / Indicador 3.1 - 3.3 (Comunicación)</w:t>
+              <w:t>SO3 / Indicador 3.1 - 3.3 (Comunicación y Video)</w:t>
             </w:r>
           </w:p>
         </w:tc>

</xml_diff>

<commit_message>
feat: add minimum and maximum gateway latency tracking to traffic sniffer and update lab documentation accordingly
</commit_message>
<xml_diff>
--- a/education/evidencias_abet/INSTRUMENTO_ABET_LAB_02_PRUEBAS_CAMARA_KINOVA_VISION.docx
+++ b/education/evidencias_abet/INSTRUMENTO_ABET_LAB_02_PRUEBAS_CAMARA_KINOVA_VISION.docx
@@ -2243,7 +2243,7 @@
                 <w:b w:val="0"/>
                 <w:sz w:val="15"/>
               </w:rPr>
-              <w:t>Captura del Dashboard del Monitor de Red (:8080) y archivo de telemetría exportado (telemetria_red_lab02.csv).</w:t>
+              <w:t>Captura del Dashboard del Monitor de Red (:8080) demostrando la estabilización del tráfico.</w:t>
             </w:r>
           </w:p>
         </w:tc>
@@ -2302,7 +2302,7 @@
                 <w:b w:val="0"/>
                 <w:sz w:val="15"/>
               </w:rPr>
-              <w:t>Archivo cyclonedds.xml y captura de verificación de recepción remota en Dispositivo B sobre Wi-Fi.</w:t>
+              <w:t>Archivo original CSV de telemetría exportado (telemetria_red_lab02.csv) para investigación de la red.</w:t>
             </w:r>
           </w:p>
         </w:tc>
@@ -2362,7 +2362,7 @@
                 <w:b w:val="0"/>
                 <w:sz w:val="15"/>
               </w:rPr>
-              <w:t>Matriz diligenciada del diagnóstico por capas ante las 5 fallas inducidas y su recuperación.</w:t>
+              <w:t>Archivo cyclonedds.xml y captura de verificación de recepción remota en Dispositivo B sobre Wi-Fi.</w:t>
             </w:r>
           </w:p>
         </w:tc>
@@ -2421,7 +2421,7 @@
                 <w:b w:val="0"/>
                 <w:sz w:val="15"/>
               </w:rPr>
-              <w:t>Video continuo del experimento (2–4 min) que muestra terminales en PC A, visor en PC B, monitor y sustentación.</w:t>
+              <w:t>Matriz diligenciada del diagnóstico por capas ante las 5 fallas inducidas y su recuperación.</w:t>
             </w:r>
           </w:p>
         </w:tc>
@@ -2481,6 +2481,65 @@
                 <w:b w:val="0"/>
                 <w:sz w:val="15"/>
               </w:rPr>
+              <w:t>Video continuo del experimento (2–4 min) que muestra terminales en PC A, visor en PC B, monitor y sustentación.</w:t>
+            </w:r>
+          </w:p>
+        </w:tc>
+        <w:tc>
+          <w:tcPr>
+            <w:tcW w:type="dxa" w:w="2835"/>
+            <w:shd w:fill="F2F2F2"/>
+            <w:vAlign w:val="center"/>
+          </w:tcPr>
+          <w:p>
+            <w:pPr>
+              <w:spacing w:after="0" w:before="0"/>
+            </w:pPr>
+            <w:r>
+              <w:rPr>
+                <w:rFonts w:ascii="Arial" w:hAnsi="Arial"/>
+                <w:b w:val="0"/>
+                <w:sz w:val="15"/>
+              </w:rPr>
+            </w:r>
+          </w:p>
+        </w:tc>
+      </w:tr>
+      <w:tr>
+        <w:tc>
+          <w:tcPr>
+            <w:tcW w:type="dxa" w:w="1134"/>
+            <w:vAlign w:val="center"/>
+          </w:tcPr>
+          <w:p>
+            <w:pPr>
+              <w:spacing w:after="0" w:before="0"/>
+            </w:pPr>
+            <w:r>
+              <w:rPr>
+                <w:rFonts w:ascii="Arial" w:hAnsi="Arial"/>
+                <w:b w:val="0"/>
+                <w:sz w:val="15"/>
+              </w:rPr>
+              <w:t>E11</w:t>
+            </w:r>
+          </w:p>
+        </w:tc>
+        <w:tc>
+          <w:tcPr>
+            <w:tcW w:type="dxa" w:w="5669"/>
+            <w:vAlign w:val="center"/>
+          </w:tcPr>
+          <w:p>
+            <w:pPr>
+              <w:spacing w:after="0" w:before="0"/>
+            </w:pPr>
+            <w:r>
+              <w:rPr>
+                <w:rFonts w:ascii="Arial" w:hAnsi="Arial"/>
+                <w:b w:val="0"/>
+                <w:sz w:val="15"/>
+              </w:rPr>
               <w:t>Informe técnico estructurado con comandos exactos, diagramas multi-PC, análisis y discusión técnica.</w:t>
             </w:r>
           </w:p>
@@ -2488,7 +2547,6 @@
         <w:tc>
           <w:tcPr>
             <w:tcW w:type="dxa" w:w="2835"/>
-            <w:shd w:fill="F2F2F2"/>
             <w:vAlign w:val="center"/>
           </w:tcPr>
           <w:p>

</xml_diff>